<commit_message>
fix: temuan minor audit — ekor lambat PG, CUSUM bias, daftar admin PG, tes flaky
- engine berat (LP/NNLS/rute) via run_cpu agar event loop tidak tertahan; pemanasan pool PG saat start
  (DB_POOL_WARMUP = 20): p95 serbuan dingin 1,7 s → ±1,0 s, error 0 %
- CUSUM & uji persistensi memakai μ₀ residual acuan (model tanpa intercept bisa bias)
- PostgreSQL: daftar pengguna admin ORDER BY created_at DESC NULLS LAST, id DESC — pendaftar baru
  tertutup 260 baris created_at NULL; users.created_at default server now() (model + migrasi 020)
- UI: CSS.escape pada selector berbasis kode komoditas; judul dialog gudang tidak di-escape ganda; sw v13
- tes upload duplikat tidak lagi flaky (gambar uji unik); docs/21 addendum D1–D6

Co-Authored-By: Claude Opus 5.5 <noreply@anthropic.com>
</commit_message>
<xml_diff>
--- a/docs/21_AUDIT_PASCA_PROTOKOL_BUG_FIX.docx
+++ b/docs/21_AUDIT_PASCA_PROTOKOL_BUG_FIX.docx
@@ -2692,6 +2692,799 @@
       </w:tr>
     </w:tbl>
     <w:p/>
+    <w:p>
+      <w:pPr>
+        <w:pStyle w:val="Heading2"/>
+      </w:pPr>
+      <w:r/>
+      <w:r>
+        <w:rPr>
+          <w:color w:val="2E7D32"/>
+        </w:rPr>
+        <w:t>Perbaikan lanjutan (temuan minor)</w:t>
+      </w:r>
+    </w:p>
+    <w:tbl>
+      <w:tblPr>
+        <w:tblStyle w:val="TableGrid"/>
+        <w:tblW w:type="auto" w:w="0"/>
+        <w:jc w:val="center"/>
+        <w:tblLook w:firstColumn="1" w:firstRow="1" w:lastColumn="0" w:lastRow="0" w:noHBand="0" w:noVBand="1" w:val="04A0"/>
+      </w:tblPr>
+      <w:tblGrid>
+        <w:gridCol w:w="2160"/>
+        <w:gridCol w:w="2160"/>
+        <w:gridCol w:w="2160"/>
+        <w:gridCol w:w="2160"/>
+      </w:tblGrid>
+      <w:tr>
+        <w:tc>
+          <w:tcPr>
+            <w:tcW w:type="dxa" w:w="2160"/>
+            <w:shd w:fill="1B5E20"/>
+          </w:tcPr>
+          <w:p>
+            <w:r>
+              <w:rPr>
+                <w:b/>
+              </w:rPr>
+            </w:r>
+            <w:r>
+              <w:rPr>
+                <w:rFonts w:ascii="Calibri" w:hAnsi="Calibri"/>
+                <w:b/>
+                <w:i w:val="0"/>
+                <w:color w:val="FFFFFF"/>
+                <w:sz w:val="19"/>
+              </w:rPr>
+              <w:t>#</w:t>
+            </w:r>
+          </w:p>
+        </w:tc>
+        <w:tc>
+          <w:tcPr>
+            <w:tcW w:type="dxa" w:w="2160"/>
+            <w:shd w:fill="1B5E20"/>
+          </w:tcPr>
+          <w:p>
+            <w:r>
+              <w:rPr>
+                <w:b/>
+              </w:rPr>
+            </w:r>
+            <w:r>
+              <w:rPr>
+                <w:rFonts w:ascii="Calibri" w:hAnsi="Calibri"/>
+                <w:b/>
+                <w:i w:val="0"/>
+                <w:color w:val="FFFFFF"/>
+                <w:sz w:val="19"/>
+              </w:rPr>
+              <w:t>Temuan</w:t>
+            </w:r>
+          </w:p>
+        </w:tc>
+        <w:tc>
+          <w:tcPr>
+            <w:tcW w:type="dxa" w:w="2160"/>
+            <w:shd w:fill="1B5E20"/>
+          </w:tcPr>
+          <w:p>
+            <w:r>
+              <w:rPr>
+                <w:b/>
+              </w:rPr>
+            </w:r>
+            <w:r>
+              <w:rPr>
+                <w:rFonts w:ascii="Calibri" w:hAnsi="Calibri"/>
+                <w:b/>
+                <w:i w:val="0"/>
+                <w:color w:val="FFFFFF"/>
+                <w:sz w:val="19"/>
+              </w:rPr>
+              <w:t>Perbaikan</w:t>
+            </w:r>
+          </w:p>
+        </w:tc>
+        <w:tc>
+          <w:tcPr>
+            <w:tcW w:type="dxa" w:w="2160"/>
+            <w:shd w:fill="1B5E20"/>
+          </w:tcPr>
+          <w:p>
+            <w:r>
+              <w:rPr>
+                <w:b/>
+              </w:rPr>
+            </w:r>
+            <w:r>
+              <w:rPr>
+                <w:rFonts w:ascii="Calibri" w:hAnsi="Calibri"/>
+                <w:b/>
+                <w:i w:val="0"/>
+                <w:color w:val="FFFFFF"/>
+                <w:sz w:val="19"/>
+              </w:rPr>
+              <w:t>Hasil terukur</w:t>
+            </w:r>
+          </w:p>
+        </w:tc>
+      </w:tr>
+      <w:tr>
+        <w:tc>
+          <w:tcPr>
+            <w:tcW w:type="dxa" w:w="2160"/>
+          </w:tcPr>
+          <w:p>
+            <w:r>
+              <w:rPr>
+                <w:rFonts w:ascii="Calibri" w:hAnsi="Calibri"/>
+                <w:b w:val="0"/>
+                <w:i w:val="0"/>
+                <w:color w:val="212121"/>
+                <w:sz w:val="19"/>
+              </w:rPr>
+              <w:t>D1</w:t>
+            </w:r>
+          </w:p>
+        </w:tc>
+        <w:tc>
+          <w:tcPr>
+            <w:tcW w:type="dxa" w:w="2160"/>
+          </w:tcPr>
+          <w:p>
+            <w:r>
+              <w:rPr>
+                <w:rFonts w:ascii="Calibri" w:hAnsi="Calibri"/>
+                <w:b w:val="0"/>
+                <w:i w:val="0"/>
+                <w:color w:val="212121"/>
+                <w:sz w:val="19"/>
+              </w:rPr>
+              <w:t>Ekor lambat saat server PostgreSQL baru menyala (p95 1,7 s pada serbuan 40 pengguna)</w:t>
+            </w:r>
+          </w:p>
+        </w:tc>
+        <w:tc>
+          <w:tcPr>
+            <w:tcW w:type="dxa" w:w="2160"/>
+          </w:tcPr>
+          <w:p>
+            <w:r>
+              <w:rPr>
+                <w:rFonts w:ascii="Calibri" w:hAnsi="Calibri"/>
+                <w:b w:val="0"/>
+                <w:i w:val="0"/>
+                <w:color w:val="212121"/>
+                <w:sz w:val="19"/>
+              </w:rPr>
+              <w:t>(a) Engine berat (LP HiGHS, NNLS, analisis rute) dipindah ke thread pool (</w:t>
+            </w:r>
+            <w:r>
+              <w:rPr>
+                <w:rFonts w:ascii="Consolas" w:hAnsi="Consolas"/>
+                <w:b w:val="0"/>
+                <w:i w:val="0"/>
+                <w:color w:val="00695C"/>
+                <w:sz w:val="18"/>
+              </w:rPr>
+              <w:t>run_cpu</w:t>
+            </w:r>
+            <w:r>
+              <w:rPr>
+                <w:rFonts w:ascii="Calibri" w:hAnsi="Calibri"/>
+                <w:b w:val="0"/>
+                <w:i w:val="0"/>
+                <w:color w:val="212121"/>
+                <w:sz w:val="19"/>
+              </w:rPr>
+              <w:t>), sehingga event loop tidak tertahan solver. (b) Pemanasan pool koneksi saat start (</w:t>
+            </w:r>
+            <w:r>
+              <w:rPr>
+                <w:rFonts w:ascii="Consolas" w:hAnsi="Consolas"/>
+                <w:b w:val="0"/>
+                <w:i w:val="0"/>
+                <w:color w:val="00695C"/>
+                <w:sz w:val="18"/>
+              </w:rPr>
+              <w:t>DB_POOL_WARMUP</w:t>
+            </w:r>
+            <w:r>
+              <w:rPr>
+                <w:rFonts w:ascii="Calibri" w:hAnsi="Calibri"/>
+                <w:b w:val="0"/>
+                <w:i w:val="0"/>
+                <w:color w:val="212121"/>
+                <w:sz w:val="19"/>
+              </w:rPr>
+              <w:t>, default = ukuran pool 20).</w:t>
+            </w:r>
+          </w:p>
+        </w:tc>
+        <w:tc>
+          <w:tcPr>
+            <w:tcW w:type="dxa" w:w="2160"/>
+          </w:tcPr>
+          <w:p>
+            <w:r>
+              <w:rPr>
+                <w:rFonts w:ascii="Calibri" w:hAnsi="Calibri"/>
+                <w:b w:val="0"/>
+                <w:i w:val="0"/>
+                <w:color w:val="212121"/>
+                <w:sz w:val="19"/>
+              </w:rPr>
+              <w:t>Dingin: p95 1,74 → ±1,0 s. Hangat: 0,5–0,65 s. Error tetap 0 %. Sisa ekor dingin = persiapan statement &amp; cache PostgreSQL di detik-detik awal; produksi: arahkan trafik setelah *readiness probe* hangat / PgBouncer. Angka bervariasi karena diukur di laptop bersama Docker.</w:t>
+            </w:r>
+          </w:p>
+        </w:tc>
+      </w:tr>
+      <w:tr>
+        <w:tc>
+          <w:tcPr>
+            <w:tcW w:type="dxa" w:w="2160"/>
+            <w:shd w:fill="F9FBE7"/>
+          </w:tcPr>
+          <w:p>
+            <w:r>
+              <w:rPr>
+                <w:rFonts w:ascii="Calibri" w:hAnsi="Calibri"/>
+                <w:b w:val="0"/>
+                <w:i w:val="0"/>
+                <w:color w:val="212121"/>
+                <w:sz w:val="19"/>
+              </w:rPr>
+              <w:t>D2</w:t>
+            </w:r>
+          </w:p>
+        </w:tc>
+        <w:tc>
+          <w:tcPr>
+            <w:tcW w:type="dxa" w:w="2160"/>
+            <w:shd w:fill="F9FBE7"/>
+          </w:tcPr>
+          <w:p>
+            <w:r>
+              <w:rPr>
+                <w:rFonts w:ascii="Calibri" w:hAnsi="Calibri"/>
+                <w:b w:val="0"/>
+                <w:i w:val="0"/>
+                <w:color w:val="212121"/>
+                <w:sz w:val="19"/>
+              </w:rPr>
+              <w:t>Titik nol CUSUM diasumsikan 0, padahal model tanpa intercept bisa bias</w:t>
+            </w:r>
+          </w:p>
+        </w:tc>
+        <w:tc>
+          <w:tcPr>
+            <w:tcW w:type="dxa" w:w="2160"/>
+            <w:shd w:fill="F9FBE7"/>
+          </w:tcPr>
+          <w:p>
+            <w:r>
+              <w:rPr>
+                <w:rFonts w:ascii="Calibri" w:hAnsi="Calibri"/>
+                <w:b w:val="0"/>
+                <w:i w:val="0"/>
+                <w:color w:val="212121"/>
+                <w:sz w:val="19"/>
+              </w:rPr>
+              <w:t>CUSUM &amp; uji persistensi memakai μ₀ = rata-rata residual periode acuan</w:t>
+            </w:r>
+          </w:p>
+        </w:tc>
+        <w:tc>
+          <w:tcPr>
+            <w:tcW w:type="dxa" w:w="2160"/>
+            <w:shd w:fill="F9FBE7"/>
+          </w:tcPr>
+          <w:p>
+            <w:r>
+              <w:rPr>
+                <w:rFonts w:ascii="Calibri" w:hAnsi="Calibri"/>
+                <w:b w:val="0"/>
+                <w:i w:val="0"/>
+                <w:color w:val="212121"/>
+                <w:sz w:val="19"/>
+              </w:rPr>
+              <w:t>Tes drift, lonjakan &amp; beban parsial tetap lulus</w:t>
+            </w:r>
+          </w:p>
+        </w:tc>
+      </w:tr>
+      <w:tr>
+        <w:tc>
+          <w:tcPr>
+            <w:tcW w:type="dxa" w:w="2160"/>
+          </w:tcPr>
+          <w:p>
+            <w:r>
+              <w:rPr>
+                <w:rFonts w:ascii="Calibri" w:hAnsi="Calibri"/>
+                <w:b w:val="0"/>
+                <w:i w:val="0"/>
+                <w:color w:val="212121"/>
+                <w:sz w:val="19"/>
+              </w:rPr>
+              <w:t>D3</w:t>
+            </w:r>
+          </w:p>
+        </w:tc>
+        <w:tc>
+          <w:tcPr>
+            <w:tcW w:type="dxa" w:w="2160"/>
+          </w:tcPr>
+          <w:p>
+            <w:r>
+              <w:rPr>
+                <w:rFonts w:ascii="Consolas" w:hAnsi="Consolas"/>
+                <w:b w:val="0"/>
+                <w:i w:val="0"/>
+                <w:color w:val="00695C"/>
+                <w:sz w:val="18"/>
+              </w:rPr>
+              <w:t>querySelector</w:t>
+            </w:r>
+            <w:r>
+              <w:rPr>
+                <w:rFonts w:ascii="Calibri" w:hAnsi="Calibri"/>
+                <w:b w:val="0"/>
+                <w:i w:val="0"/>
+                <w:color w:val="212121"/>
+                <w:sz w:val="19"/>
+              </w:rPr>
+              <w:t xml:space="preserve"> dari kode komoditas error bila kode mengandung tanda kutip</w:t>
+            </w:r>
+          </w:p>
+        </w:tc>
+        <w:tc>
+          <w:tcPr>
+            <w:tcW w:type="dxa" w:w="2160"/>
+          </w:tcPr>
+          <w:p>
+            <w:r>
+              <w:rPr>
+                <w:rFonts w:ascii="Consolas" w:hAnsi="Consolas"/>
+                <w:b w:val="0"/>
+                <w:i w:val="0"/>
+                <w:color w:val="00695C"/>
+                <w:sz w:val="18"/>
+              </w:rPr>
+              <w:t>CSS.escape()</w:t>
+            </w:r>
+          </w:p>
+        </w:tc>
+        <w:tc>
+          <w:tcPr>
+            <w:tcW w:type="dxa" w:w="2160"/>
+          </w:tcPr>
+          <w:p>
+            <w:r>
+              <w:rPr>
+                <w:rFonts w:ascii="Calibri" w:hAnsi="Calibri"/>
+                <w:b w:val="0"/>
+                <w:i w:val="0"/>
+                <w:color w:val="212121"/>
+                <w:sz w:val="19"/>
+              </w:rPr>
+              <w:t>—</w:t>
+            </w:r>
+          </w:p>
+        </w:tc>
+      </w:tr>
+      <w:tr>
+        <w:tc>
+          <w:tcPr>
+            <w:tcW w:type="dxa" w:w="2160"/>
+            <w:shd w:fill="F9FBE7"/>
+          </w:tcPr>
+          <w:p>
+            <w:r>
+              <w:rPr>
+                <w:rFonts w:ascii="Calibri" w:hAnsi="Calibri"/>
+                <w:b w:val="0"/>
+                <w:i w:val="0"/>
+                <w:color w:val="212121"/>
+                <w:sz w:val="19"/>
+              </w:rPr>
+              <w:t>D4</w:t>
+            </w:r>
+          </w:p>
+        </w:tc>
+        <w:tc>
+          <w:tcPr>
+            <w:tcW w:type="dxa" w:w="2160"/>
+            <w:shd w:fill="F9FBE7"/>
+          </w:tcPr>
+          <w:p>
+            <w:r>
+              <w:rPr>
+                <w:rFonts w:ascii="Calibri" w:hAnsi="Calibri"/>
+                <w:b w:val="0"/>
+                <w:i w:val="0"/>
+                <w:color w:val="212121"/>
+                <w:sz w:val="19"/>
+              </w:rPr>
+              <w:t xml:space="preserve">Judul dialog gudang di-escape dua kali (tampil </w:t>
+            </w:r>
+            <w:r>
+              <w:rPr>
+                <w:rFonts w:ascii="Consolas" w:hAnsi="Consolas"/>
+                <w:b w:val="0"/>
+                <w:i w:val="0"/>
+                <w:color w:val="00695C"/>
+                <w:sz w:val="18"/>
+              </w:rPr>
+              <w:t>&amp;amp;</w:t>
+            </w:r>
+            <w:r>
+              <w:rPr>
+                <w:rFonts w:ascii="Calibri" w:hAnsi="Calibri"/>
+                <w:b w:val="0"/>
+                <w:i w:val="0"/>
+                <w:color w:val="212121"/>
+                <w:sz w:val="19"/>
+              </w:rPr>
+              <w:t>)</w:t>
+            </w:r>
+          </w:p>
+        </w:tc>
+        <w:tc>
+          <w:tcPr>
+            <w:tcW w:type="dxa" w:w="2160"/>
+            <w:shd w:fill="F9FBE7"/>
+          </w:tcPr>
+          <w:p>
+            <w:r>
+              <w:rPr>
+                <w:rFonts w:ascii="Calibri" w:hAnsi="Calibri"/>
+                <w:b w:val="0"/>
+                <w:i w:val="0"/>
+                <w:color w:val="212121"/>
+                <w:sz w:val="19"/>
+              </w:rPr>
+              <w:t xml:space="preserve">Escape satu kali di </w:t>
+            </w:r>
+            <w:r>
+              <w:rPr>
+                <w:rFonts w:ascii="Consolas" w:hAnsi="Consolas"/>
+                <w:b w:val="0"/>
+                <w:i w:val="0"/>
+                <w:color w:val="00695C"/>
+                <w:sz w:val="18"/>
+              </w:rPr>
+              <w:t>formDialog</w:t>
+            </w:r>
+          </w:p>
+        </w:tc>
+        <w:tc>
+          <w:tcPr>
+            <w:tcW w:type="dxa" w:w="2160"/>
+            <w:shd w:fill="F9FBE7"/>
+          </w:tcPr>
+          <w:p>
+            <w:r>
+              <w:rPr>
+                <w:rFonts w:ascii="Calibri" w:hAnsi="Calibri"/>
+                <w:b w:val="0"/>
+                <w:i w:val="0"/>
+                <w:color w:val="212121"/>
+                <w:sz w:val="19"/>
+              </w:rPr>
+              <w:t>—</w:t>
+            </w:r>
+          </w:p>
+        </w:tc>
+      </w:tr>
+      <w:tr>
+        <w:tc>
+          <w:tcPr>
+            <w:tcW w:type="dxa" w:w="2160"/>
+          </w:tcPr>
+          <w:p>
+            <w:r>
+              <w:rPr>
+                <w:rFonts w:ascii="Calibri" w:hAnsi="Calibri"/>
+                <w:b w:val="0"/>
+                <w:i w:val="0"/>
+                <w:color w:val="212121"/>
+                <w:sz w:val="19"/>
+              </w:rPr>
+              <w:t>D5</w:t>
+            </w:r>
+          </w:p>
+        </w:tc>
+        <w:tc>
+          <w:tcPr>
+            <w:tcW w:type="dxa" w:w="2160"/>
+          </w:tcPr>
+          <w:p>
+            <w:r>
+              <w:rPr>
+                <w:rFonts w:ascii="Calibri" w:hAnsi="Calibri"/>
+                <w:b/>
+                <w:i w:val="0"/>
+                <w:color w:val="212121"/>
+                <w:sz w:val="19"/>
+              </w:rPr>
+              <w:t>PostgreSQL: pendaftar baru tak terlihat di daftar pengguna admin.</w:t>
+            </w:r>
+            <w:r>
+              <w:rPr>
+                <w:rFonts w:ascii="Calibri" w:hAnsi="Calibri"/>
+                <w:b w:val="0"/>
+                <w:i w:val="0"/>
+                <w:color w:val="212121"/>
+                <w:sz w:val="19"/>
+              </w:rPr>
+              <w:t xml:space="preserve"> 260 pengepul ber-</w:t>
+            </w:r>
+            <w:r>
+              <w:rPr>
+                <w:rFonts w:ascii="Consolas" w:hAnsi="Consolas"/>
+                <w:b w:val="0"/>
+                <w:i w:val="0"/>
+                <w:color w:val="00695C"/>
+                <w:sz w:val="18"/>
+              </w:rPr>
+              <w:t>created_at</w:t>
+            </w:r>
+            <w:r>
+              <w:rPr>
+                <w:rFonts w:ascii="Calibri" w:hAnsi="Calibri"/>
+                <w:b w:val="0"/>
+                <w:i w:val="0"/>
+                <w:color w:val="212121"/>
+                <w:sz w:val="19"/>
+              </w:rPr>
+              <w:t xml:space="preserve"> NULL (insert SQL mentah) terurut paling atas pada DESC dan memenuhi batas 200</w:t>
+            </w:r>
+          </w:p>
+        </w:tc>
+        <w:tc>
+          <w:tcPr>
+            <w:tcW w:type="dxa" w:w="2160"/>
+          </w:tcPr>
+          <w:p>
+            <w:r>
+              <w:rPr>
+                <w:rFonts w:ascii="Consolas" w:hAnsi="Consolas"/>
+                <w:b w:val="0"/>
+                <w:i w:val="0"/>
+                <w:color w:val="00695C"/>
+                <w:sz w:val="18"/>
+              </w:rPr>
+              <w:t>ORDER BY created_at DESC NULLS LAST, id DESC</w:t>
+            </w:r>
+            <w:r>
+              <w:rPr>
+                <w:rFonts w:ascii="Calibri" w:hAnsi="Calibri"/>
+                <w:b w:val="0"/>
+                <w:i w:val="0"/>
+                <w:color w:val="212121"/>
+                <w:sz w:val="19"/>
+              </w:rPr>
+              <w:t xml:space="preserve">; </w:t>
+            </w:r>
+            <w:r>
+              <w:rPr>
+                <w:rFonts w:ascii="Consolas" w:hAnsi="Consolas"/>
+                <w:b w:val="0"/>
+                <w:i w:val="0"/>
+                <w:color w:val="00695C"/>
+                <w:sz w:val="18"/>
+              </w:rPr>
+              <w:t>users.created_at</w:t>
+            </w:r>
+            <w:r>
+              <w:rPr>
+                <w:rFonts w:ascii="Calibri" w:hAnsi="Calibri"/>
+                <w:b w:val="0"/>
+                <w:i w:val="0"/>
+                <w:color w:val="212121"/>
+                <w:sz w:val="19"/>
+              </w:rPr>
+              <w:t xml:space="preserve"> default server </w:t>
+            </w:r>
+            <w:r>
+              <w:rPr>
+                <w:rFonts w:ascii="Consolas" w:hAnsi="Consolas"/>
+                <w:b w:val="0"/>
+                <w:i w:val="0"/>
+                <w:color w:val="00695C"/>
+                <w:sz w:val="18"/>
+              </w:rPr>
+              <w:t>now()</w:t>
+            </w:r>
+            <w:r>
+              <w:rPr>
+                <w:rFonts w:ascii="Calibri" w:hAnsi="Calibri"/>
+                <w:b w:val="0"/>
+                <w:i w:val="0"/>
+                <w:color w:val="212121"/>
+                <w:sz w:val="19"/>
+              </w:rPr>
+              <w:t xml:space="preserve"> (model + migrasi 020)</w:t>
+            </w:r>
+          </w:p>
+        </w:tc>
+        <w:tc>
+          <w:tcPr>
+            <w:tcW w:type="dxa" w:w="2160"/>
+          </w:tcPr>
+          <w:p>
+            <w:r>
+              <w:rPr>
+                <w:rFonts w:ascii="Consolas" w:hAnsi="Consolas"/>
+                <w:b w:val="0"/>
+                <w:i w:val="0"/>
+                <w:color w:val="00695C"/>
+                <w:sz w:val="18"/>
+              </w:rPr>
+              <w:t>test_register_and_admin_user_management</w:t>
+            </w:r>
+            <w:r>
+              <w:rPr>
+                <w:rFonts w:ascii="Calibri" w:hAnsi="Calibri"/>
+                <w:b w:val="0"/>
+                <w:i w:val="0"/>
+                <w:color w:val="212121"/>
+                <w:sz w:val="19"/>
+              </w:rPr>
+              <w:t xml:space="preserve"> lulus di PG dev</w:t>
+            </w:r>
+          </w:p>
+        </w:tc>
+      </w:tr>
+      <w:tr>
+        <w:tc>
+          <w:tcPr>
+            <w:tcW w:type="dxa" w:w="2160"/>
+            <w:shd w:fill="F9FBE7"/>
+          </w:tcPr>
+          <w:p>
+            <w:r>
+              <w:rPr>
+                <w:rFonts w:ascii="Calibri" w:hAnsi="Calibri"/>
+                <w:b w:val="0"/>
+                <w:i w:val="0"/>
+                <w:color w:val="212121"/>
+                <w:sz w:val="19"/>
+              </w:rPr>
+              <w:t>D6</w:t>
+            </w:r>
+          </w:p>
+        </w:tc>
+        <w:tc>
+          <w:tcPr>
+            <w:tcW w:type="dxa" w:w="2160"/>
+            <w:shd w:fill="F9FBE7"/>
+          </w:tcPr>
+          <w:p>
+            <w:r>
+              <w:rPr>
+                <w:rFonts w:ascii="Calibri" w:hAnsi="Calibri"/>
+                <w:b w:val="0"/>
+                <w:i w:val="0"/>
+                <w:color w:val="212121"/>
+                <w:sz w:val="19"/>
+              </w:rPr>
+              <w:t>Tes upload duplikat flaky: hanya 250 variasi gambar, folder upload bertahan antar-run</w:t>
+            </w:r>
+          </w:p>
+        </w:tc>
+        <w:tc>
+          <w:tcPr>
+            <w:tcW w:type="dxa" w:w="2160"/>
+            <w:shd w:fill="F9FBE7"/>
+          </w:tcPr>
+          <w:p>
+            <w:r>
+              <w:rPr>
+                <w:rFonts w:ascii="Calibri" w:hAnsi="Calibri"/>
+                <w:b w:val="0"/>
+                <w:i w:val="0"/>
+                <w:color w:val="212121"/>
+                <w:sz w:val="19"/>
+              </w:rPr>
+              <w:t>Gambar uji unik dari seed 128-bit</w:t>
+            </w:r>
+          </w:p>
+        </w:tc>
+        <w:tc>
+          <w:tcPr>
+            <w:tcW w:type="dxa" w:w="2160"/>
+            <w:shd w:fill="F9FBE7"/>
+          </w:tcPr>
+          <w:p>
+            <w:r>
+              <w:rPr>
+                <w:rFonts w:ascii="Calibri" w:hAnsi="Calibri"/>
+                <w:b w:val="0"/>
+                <w:i w:val="0"/>
+                <w:color w:val="212121"/>
+                <w:sz w:val="19"/>
+              </w:rPr>
+              <w:t>lulus</w:t>
+            </w:r>
+          </w:p>
+        </w:tc>
+      </w:tr>
+      <w:tr>
+        <w:tc>
+          <w:tcPr>
+            <w:tcW w:type="dxa" w:w="2160"/>
+          </w:tcPr>
+          <w:p>
+            <w:r>
+              <w:rPr>
+                <w:rFonts w:ascii="Calibri" w:hAnsi="Calibri"/>
+                <w:b w:val="0"/>
+                <w:i w:val="0"/>
+                <w:color w:val="212121"/>
+                <w:sz w:val="19"/>
+              </w:rPr>
+              <w:t>—</w:t>
+            </w:r>
+          </w:p>
+        </w:tc>
+        <w:tc>
+          <w:tcPr>
+            <w:tcW w:type="dxa" w:w="2160"/>
+          </w:tcPr>
+          <w:p>
+            <w:r>
+              <w:rPr>
+                <w:rFonts w:ascii="Calibri" w:hAnsi="Calibri"/>
+                <w:b w:val="0"/>
+                <w:i w:val="0"/>
+                <w:color w:val="212121"/>
+                <w:sz w:val="19"/>
+              </w:rPr>
+              <w:t>Service worker</w:t>
+            </w:r>
+          </w:p>
+        </w:tc>
+        <w:tc>
+          <w:tcPr>
+            <w:tcW w:type="dxa" w:w="2160"/>
+          </w:tcPr>
+          <w:p>
+            <w:r>
+              <w:rPr>
+                <w:rFonts w:ascii="Calibri" w:hAnsi="Calibri"/>
+                <w:b w:val="0"/>
+                <w:i w:val="0"/>
+                <w:color w:val="212121"/>
+                <w:sz w:val="19"/>
+              </w:rPr>
+              <w:t>v13 agar HP lapangan memuat UI terbaru</w:t>
+            </w:r>
+          </w:p>
+        </w:tc>
+        <w:tc>
+          <w:tcPr>
+            <w:tcW w:type="dxa" w:w="2160"/>
+          </w:tcPr>
+          <w:p>
+            <w:r>
+              <w:rPr>
+                <w:rFonts w:ascii="Calibri" w:hAnsi="Calibri"/>
+                <w:b w:val="0"/>
+                <w:i w:val="0"/>
+                <w:color w:val="212121"/>
+                <w:sz w:val="19"/>
+              </w:rPr>
+              <w:t>—</w:t>
+            </w:r>
+          </w:p>
+        </w:tc>
+      </w:tr>
+    </w:tbl>
+    <w:p/>
     <w:sectPr>
       <w:pgSz w:w="12240" w:h="15840"/>
       <w:pgMar w:top="1440" w:right="1800" w:bottom="1440" w:left="1800" w:header="720" w:footer="720" w:gutter="0"/>

</xml_diff>